<commit_message>
docs(srs): record the live pipeline on develop
PR #95 brought the MQTT publisher, the video push and the pytest CI job
of PR #89 into develop. Defect DF-1 is closed; Report 4 sections 3.3,
5.2 and 12, gap #7, the Design Brief (G4, R1), Project Tracking, the
to-do list, Report 5 and the staging notes now describe what is left:
a trained model, a run against staging and sessions from buckets.
</commit_message>
<xml_diff>
--- a/docs/reports/design-brief/SWP490_R2_BM01_Design_Brief_SwiftletCare.docx
+++ b/docs/reports/design-brief/SWP490_R2_BM01_Design_Brief_SwiftletCare.docx
@@ -3059,7 +3059,7 @@
                 <w:sz w:val="19"/>
                 <w:szCs w:val="19"/>
               </w:rPr>
-              <w:t>No trained swiftlet model; spare PC may not reach 25 fps (≈ 7 fps on a laptop)</w:t>
+              <w:t>No trained swiftlet model; spare PC may not reach 25 fps (≈ 7–12 fps on a laptop)</w:t>
             </w:r>
           </w:p>
         </w:tc>
@@ -4335,7 +4335,7 @@
                 <w:sz w:val="19"/>
                 <w:szCs w:val="19"/>
               </w:rPr>
-              <w:t>Pipeline publishes nothing; sessions from buckets</w:t>
+              <w:t>Pipeline not run on staging; sessions from buckets</w:t>
             </w:r>
           </w:p>
         </w:tc>
@@ -4397,7 +4397,7 @@
                 <w:sz w:val="19"/>
                 <w:szCs w:val="19"/>
               </w:rPr>
-              <w:t>MQTT + RTSPS push</w:t>
+              <w:t>Run on the AI node PC</w:t>
             </w:r>
           </w:p>
         </w:tc>
@@ -11495,7 +11495,7 @@
                 <w:sz w:val="19"/>
                 <w:szCs w:val="19"/>
               </w:rPr>
-              <w:t>Expert screens; expert backend (review, proposals, notices)</w:t>
+              <w:t>Expert screens; expert backend (reviews, proposals)</w:t>
             </w:r>
           </w:p>
         </w:tc>

</xml_diff>

<commit_message>
docs(srs): separate actors from the system's own components
The controller, the AI node and the backend are parts of SwiftletCare,
not actors. Report 3 section 2.3 now lists actors (people and external
services) apart from these components, the flow table lists only real
actors and the FR column is named Actor / component. The Design Brief
features and Appendix A1 follow, with a note that WF-03 and WF-09 have
one actor and qualify by three mandatory features; Report 4 section 9
names the activity-diagram lanes accordingly.
</commit_message>
<xml_diff>
--- a/docs/reports/design-brief/SWP490_R2_BM01_Design_Brief_SwiftletCare.docx
+++ b/docs/reports/design-brief/SWP490_R2_BM01_Design_Brief_SwiftletCare.docx
@@ -5367,7 +5367,7 @@
                 <w:sz w:val="19"/>
                 <w:szCs w:val="19"/>
               </w:rPr>
-              <w:t>Controller, FO</w:t>
+              <w:t>FO, DE</w:t>
             </w:r>
           </w:p>
         </w:tc>
@@ -5555,7 +5555,7 @@
                 <w:sz w:val="19"/>
                 <w:szCs w:val="19"/>
               </w:rPr>
-              <w:t>Controller</w:t>
+              <w:t>FO (auto)</w:t>
             </w:r>
           </w:p>
         </w:tc>
@@ -5931,7 +5931,7 @@
                 <w:sz w:val="19"/>
                 <w:szCs w:val="19"/>
               </w:rPr>
-              <w:t>Controller</w:t>
+              <w:t>FO (auto)</w:t>
             </w:r>
           </w:p>
         </w:tc>
@@ -6119,7 +6119,7 @@
                 <w:sz w:val="19"/>
                 <w:szCs w:val="19"/>
               </w:rPr>
-              <w:t>Controller</w:t>
+              <w:t>FO (auto)</w:t>
             </w:r>
           </w:p>
         </w:tc>
@@ -6307,7 +6307,7 @@
                 <w:sz w:val="19"/>
                 <w:szCs w:val="19"/>
               </w:rPr>
-              <w:t>Controller</w:t>
+              <w:t>FO (auto)</w:t>
             </w:r>
           </w:p>
         </w:tc>
@@ -6495,7 +6495,7 @@
                 <w:sz w:val="19"/>
                 <w:szCs w:val="19"/>
               </w:rPr>
-              <w:t>Backend, FO</w:t>
+              <w:t>FO</w:t>
             </w:r>
           </w:p>
         </w:tc>
@@ -6683,7 +6683,7 @@
                 <w:sz w:val="19"/>
                 <w:szCs w:val="19"/>
               </w:rPr>
-              <w:t>Backend, FO</w:t>
+              <w:t>FO, Telegram, FCM</w:t>
             </w:r>
           </w:p>
         </w:tc>
@@ -6871,7 +6871,7 @@
                 <w:sz w:val="19"/>
                 <w:szCs w:val="19"/>
               </w:rPr>
-              <w:t>Backend</w:t>
+              <w:t>FO, DE (auto)</w:t>
             </w:r>
           </w:p>
         </w:tc>
@@ -7059,7 +7059,7 @@
                 <w:sz w:val="19"/>
                 <w:szCs w:val="19"/>
               </w:rPr>
-              <w:t>AI node, Backend</w:t>
+              <w:t>FO, DE (auto)</w:t>
             </w:r>
           </w:p>
         </w:tc>
@@ -7435,7 +7435,7 @@
                 <w:sz w:val="19"/>
                 <w:szCs w:val="19"/>
               </w:rPr>
-              <w:t>Controller</w:t>
+              <w:t>DE (auto)</w:t>
             </w:r>
           </w:p>
         </w:tc>
@@ -8939,7 +8939,7 @@
                 <w:sz w:val="19"/>
                 <w:szCs w:val="19"/>
               </w:rPr>
-              <w:t>Backend</w:t>
+              <w:t>FO, DE (auto)</w:t>
             </w:r>
           </w:p>
         </w:tc>
@@ -9419,7 +9419,7 @@
         <w:spacing w:after="60"/>
       </w:pPr>
       <w:r>
-        <w:t>FO = Farm Owner; DE = Domain Expert (or the Farm Owner on a farm without one, BR-22). Status as of the review-2 tag.</w:t>
+        <w:t>FO = Farm Owner; DE = Domain Expert (Farm Owner if none, BR-22); (auto) = done by a system component, not an actor.</w:t>
       </w:r>
     </w:p>
     <w:p>
@@ -11982,7 +11982,7 @@
                 <w:sz w:val="19"/>
                 <w:szCs w:val="19"/>
               </w:rPr>
-              <w:t>Controller, Farm Owner, Domain Expert</w:t>
+              <w:t>Farm Owner, Domain Expert</w:t>
             </w:r>
           </w:p>
         </w:tc>
@@ -12232,7 +12232,7 @@
                 <w:sz w:val="19"/>
                 <w:szCs w:val="19"/>
               </w:rPr>
-              <w:t>Controller, Backend, Farm Owner, Domain Expert</w:t>
+              <w:t>Farm Owner, Domain Expert, Telegram, FCM</w:t>
             </w:r>
           </w:p>
         </w:tc>
@@ -12482,7 +12482,7 @@
                 <w:sz w:val="19"/>
                 <w:szCs w:val="19"/>
               </w:rPr>
-              <w:t>Controller, Backend, Farm Owner</w:t>
+              <w:t>Farm Owner</w:t>
             </w:r>
           </w:p>
         </w:tc>
@@ -12732,7 +12732,7 @@
                 <w:sz w:val="19"/>
                 <w:szCs w:val="19"/>
               </w:rPr>
-              <w:t>Controller, Backend, Farm Owner</w:t>
+              <w:t>Farm Owner, Telegram, FCM</w:t>
             </w:r>
           </w:p>
         </w:tc>
@@ -12982,7 +12982,7 @@
                 <w:sz w:val="19"/>
                 <w:szCs w:val="19"/>
               </w:rPr>
-              <w:t>Backend, Farm Owner, Domain Expert</w:t>
+              <w:t>Farm Owner, Domain Expert</w:t>
             </w:r>
           </w:p>
         </w:tc>
@@ -13232,7 +13232,7 @@
                 <w:sz w:val="19"/>
                 <w:szCs w:val="19"/>
               </w:rPr>
-              <w:t>AI node, Backend, Farm Owner</w:t>
+              <w:t>Farm Owner, Domain Expert</w:t>
             </w:r>
           </w:p>
         </w:tc>
@@ -13482,7 +13482,7 @@
                 <w:sz w:val="19"/>
                 <w:szCs w:val="19"/>
               </w:rPr>
-              <w:t>Controller, Backend, Domain Expert, Farm Owner</w:t>
+              <w:t>Domain Expert, Farm Owner</w:t>
             </w:r>
           </w:p>
         </w:tc>
@@ -13732,7 +13732,7 @@
                 <w:sz w:val="19"/>
                 <w:szCs w:val="19"/>
               </w:rPr>
-              <w:t>Domain Expert, Farm Owner, Backend</w:t>
+              <w:t>Domain Expert, Farm Owner</w:t>
             </w:r>
           </w:p>
         </w:tc>
@@ -13982,7 +13982,7 @@
                 <w:sz w:val="19"/>
                 <w:szCs w:val="19"/>
               </w:rPr>
-              <w:t>Farm Owner, Controller</w:t>
+              <w:t>Farm Owner</w:t>
             </w:r>
           </w:p>
         </w:tc>
@@ -14232,7 +14232,7 @@
                 <w:sz w:val="19"/>
                 <w:szCs w:val="19"/>
               </w:rPr>
-              <w:t>Administrator, Farm Owner, Controller, Backend</w:t>
+              <w:t>Administrator, Farm Owner</w:t>
             </w:r>
           </w:p>
         </w:tc>
@@ -14482,7 +14482,7 @@
                 <w:sz w:val="19"/>
                 <w:szCs w:val="19"/>
               </w:rPr>
-              <w:t>Backend, Farm Owner, Domain Expert, weather service</w:t>
+              <w:t>Farm Owner, Domain Expert, Open-Meteo</w:t>
             </w:r>
           </w:p>
         </w:tc>
@@ -14643,6 +14643,14 @@
         </w:tc>
       </w:tr>
     </w:tbl>
+    <w:p>
+      <w:pPr>
+        <w:spacing w:after="60"/>
+      </w:pPr>
+      <w:r>
+        <w:t>Actors are people and external services only; the controller, the AI node and the backend are parts of SwiftletCare (SRS 2.3). WF-03 and WF-09 have one actor and are valid because each passes through three mandatory features.</w:t>
+      </w:r>
+    </w:p>
     <w:p>
       <w:pPr>
         <w:pStyle w:val="Heading3"/>

</xml_diff>

<commit_message>
docs(srs): run the AI node on a spare PC at a member's home
The team keeps the spare PC at a member's home instead of the borrowed
swiftlet house. It reads the camera's RTSP feed over the Internet through
the port forwarded on the house modem, whose VNPT line has a static IP.
Report 4 1.0.7 rewrites D5 with the costs (house uplink, either line
down makes the session incomplete, the open camera port) and the checks
(24-hour pull test, same clip read locally and over the Internet), and
updates the architecture, deployment and security sections. Report 3
section 2.5 and the known limitations, the registration form wording,
the staging guide, the to-do list and the CLAUDE.md files follow.
</commit_message>
<xml_diff>
--- a/docs/reports/design-brief/SWP490_R2_BM01_Design_Brief_SwiftletCare.docx
+++ b/docs/reports/design-brief/SWP490_R2_BM01_Design_Brief_SwiftletCare.docx
@@ -460,7 +460,7 @@
                 <w:sz w:val="19"/>
                 <w:szCs w:val="19"/>
               </w:rPr>
-              <w:t>1.0 (registration v3, SRS 3.0.0, SDD 1.0.6)</w:t>
+              <w:t>1.0 (registration v3, SRS 3.0.0, SDD 1.0.7)</w:t>
             </w:r>
           </w:p>
         </w:tc>
@@ -1605,7 +1605,7 @@
         <w:spacing w:after="60"/>
       </w:pPr>
       <w:r>
-        <w:t>Swiftlet houses are closed buildings that owners visit every few days, so humidity drift, equipment faults and a falling flock go unnoticed. SwiftletCare lets the house regulate and watch itself. On each floor an ESP32 controller reads five RS485 sensors and drives misting, fan and speaker with fuzzy logic, even without Internet. A PC at the house counts birds at the entrance (YOLO + ByteTrack) and streams annotated video. A cloud backend raises alerts, forecasts breaches and gives every house one daily health status combining environment, air quality, return rate and noise by agreement. The Farm Owner monitors, overrides and sets up devices by QR code; a Domain Expert validates inferred alerts and tunes parameters; Technician and Administrator support them. Architecture: SDD 2.1; deployment: SDD 11.</w:t>
+        <w:t>Swiftlet houses are closed buildings that owners visit every few days, so humidity drift, equipment faults and a falling flock go unnoticed. SwiftletCare lets the house regulate and watch itself. On each floor an ESP32 controller reads five RS485 sensors and drives misting, fan and speaker with fuzzy logic, even without Internet. A PC reads the entrance camera, counts birds (YOLO + ByteTrack) and streams annotated video. A cloud backend raises alerts, forecasts breaches and gives every house one daily health status combining environment, air quality, return rate and noise by agreement. The Farm Owner monitors, overrides and sets up devices by QR code; a Domain Expert validates inferred alerts and tunes parameters; Technician and Administrator support them. Architecture: SDD 2.1; deployment: SDD 11.</w:t>
       </w:r>
     </w:p>
     <w:p>

</xml_diff>

<commit_message>
docs(srs): remove tickets, SLA and Technician regions from scope
Review 1 found the project "more like a platform than a system", and the
supervisor asked to keep the Technician only as a role for technical work.

- Report 3: no tickets, SLA, routing, KPIs, maintenance schedules or
  Technician regions (section 8). The Technician sees the devices and
  device alerts of every farm, sets devices up and sends remote commands
  (FARM-FR-009, 013), never switches relays or acknowledges alerts; the
  Farm Owners are notified of every device action. Alerts nobody
  acknowledges are sent again (ALERT-FR-015) and pump or fan wear raises
  MAINTENANCE_DUE (ALERT-FR-016). Only Farm Owners create and manage farms.
- Report 4 1.0.8: decision D14, ERD, jobs, REST and socket, SM-05 removed,
  AD-04 and AD-11 rewritten, gaps.
- Registration v3 item (15), BM03 row 9, Design Brief, Reports 1 and 2,
  tracking, gap list #41-#46, todo, CLAUDE.md files and review rules.
</commit_message>
<xml_diff>
--- a/docs/reports/design-brief/SWP490_R2_BM01_Design_Brief_SwiftletCare.docx
+++ b/docs/reports/design-brief/SWP490_R2_BM01_Design_Brief_SwiftletCare.docx
@@ -460,7 +460,7 @@
                 <w:sz w:val="19"/>
                 <w:szCs w:val="19"/>
               </w:rPr>
-              <w:t>1.0 (registration v3, SRS 3.0.0, SDD 1.0.7)</w:t>
+              <w:t>1.0 (registration v3, SRS 3.0.0, SDD 1.0.8)</w:t>
             </w:r>
           </w:p>
         </w:tc>
@@ -905,7 +905,7 @@
                 <w:sz w:val="19"/>
                 <w:szCs w:val="19"/>
               </w:rPr>
-              <w:t>Technician installs devices</w:t>
+              <w:t>Technician installs on tickets</w:t>
             </w:r>
           </w:p>
         </w:tc>
@@ -936,7 +936,7 @@
                 <w:sz w:val="19"/>
                 <w:szCs w:val="19"/>
               </w:rPr>
-              <w:t>Flow 10: Farm Owner sets up by label and floor QR codes</w:t>
+              <w:t>Flow 10: owner sets up by QR; no tickets; Technician on devices only</w:t>
             </w:r>
           </w:p>
         </w:tc>
@@ -967,7 +967,7 @@
                 <w:sz w:val="19"/>
                 <w:szCs w:val="19"/>
               </w:rPr>
-              <w:t>Review 1: simplest possible setup</w:t>
+              <w:t>Review 1: simple setup; "platform, not system"</w:t>
             </w:r>
           </w:p>
         </w:tc>
@@ -1546,7 +1546,7 @@
                 <w:sz w:val="19"/>
                 <w:szCs w:val="19"/>
               </w:rPr>
-              <w:t>Marketplace, buyer role, Zalo/SMS, bypass switches, 24/7 production</w:t>
+              <w:t>Marketplace, buyer role, tickets, SLA, regions, Zalo/SMS, bypass switches, 24/7 production</w:t>
             </w:r>
           </w:p>
         </w:tc>
@@ -1577,7 +1577,7 @@
                 <w:sz w:val="19"/>
                 <w:szCs w:val="19"/>
               </w:rPr>
-              <w:t>Removed after Review 1; borrowed house; prototype and staging only</w:t>
+              <w:t>Removed after Review 1 (platform functions); borrowed house; prototype and staging only</w:t>
             </w:r>
           </w:p>
         </w:tc>
@@ -3771,7 +3771,7 @@
                 <w:sz w:val="19"/>
                 <w:szCs w:val="19"/>
               </w:rPr>
-              <w:t>Role checks on thresholds, overrides, device setup differ from SRS 2.4</w:t>
+              <w:t>Roles differ from SRS 2.4; tickets still in code</w:t>
             </w:r>
           </w:p>
         </w:tc>
@@ -3802,7 +3802,7 @@
                 <w:sz w:val="19"/>
                 <w:szCs w:val="19"/>
               </w:rPr>
-              <w:t>backend routes</w:t>
+              <w:t>backend, clients</w:t>
             </w:r>
           </w:p>
         </w:tc>
@@ -3833,7 +3833,7 @@
                 <w:sz w:val="19"/>
                 <w:szCs w:val="19"/>
               </w:rPr>
-              <w:t>Fix roles, spec, tests</w:t>
+              <w:t>Fix roles; drop tickets</w:t>
             </w:r>
           </w:p>
         </w:tc>
@@ -11024,7 +11024,7 @@
                 <w:sz w:val="19"/>
                 <w:szCs w:val="19"/>
               </w:rPr>
-              <w:t>Backend devices and setup; tickets; mobile app</w:t>
+              <w:t>Backend devices and setup; ticket removal; mobile app</w:t>
             </w:r>
           </w:p>
         </w:tc>
@@ -12794,7 +12794,7 @@
                 <w:sz w:val="19"/>
                 <w:szCs w:val="19"/>
               </w:rPr>
-              <w:t>Loop in a safe state; alert raised and acknowledged</w:t>
+              <w:t>Loop in a safe state; alert raised, sent again until acknowledged</w:t>
             </w:r>
           </w:p>
         </w:tc>

</xml_diff>

<commit_message>
docs(srs): close the platform-removal gaps after PR #100-#106
Tickets, SLA, Technician regions and the Administrator's farm management are
gone from the code, so the documents stop listing them as gaps.

- README "Chỗ lệch": close #2, #15, #25, #41-#46; fix the merged cells of #44, #47
- Report 4 1.0.10: drop the Permissions and Supporting roles rows of §12, the
  "still in the code" sentence of §6.1 and the done rows of §6.4
- Design Brief G1 closed, G7 without SALES_STAFF; BM01 docx regenerated
- Project Tracking: DF-2, DF-3 closed; F-03, F-07, F-17, F-18; Jest count 519
- todo-review2, root CLAUDE.md module status, backend README
- todo-remove-platform: PR 7 done
</commit_message>
<xml_diff>
--- a/docs/reports/design-brief/SWP490_R2_BM01_Design_Brief_SwiftletCare.docx
+++ b/docs/reports/design-brief/SWP490_R2_BM01_Design_Brief_SwiftletCare.docx
@@ -3771,7 +3771,7 @@
                 <w:sz w:val="19"/>
                 <w:szCs w:val="19"/>
               </w:rPr>
-              <w:t>Roles differ from SRS 2.4; tickets still in code</w:t>
+              <w:t>Roles per SRS 2.4; tickets, SLA and regions removed</w:t>
             </w:r>
           </w:p>
         </w:tc>
@@ -3833,7 +3833,7 @@
                 <w:sz w:val="19"/>
                 <w:szCs w:val="19"/>
               </w:rPr>
-              <w:t>Fix roles; drop tickets</w:t>
+              <w:t>Closed: PR #100–#106</w:t>
             </w:r>
           </w:p>
         </w:tc>
@@ -3895,7 +3895,7 @@
                 <w:sz w:val="19"/>
                 <w:szCs w:val="19"/>
               </w:rPr>
-              <w:t>It. 2</w:t>
+              <w:t>Done</w:t>
             </w:r>
           </w:p>
         </w:tc>
@@ -4899,7 +4899,7 @@
                 <w:sz w:val="19"/>
                 <w:szCs w:val="19"/>
               </w:rPr>
-              <w:t>Web leftovers (SALES_STAFF, Technician threshold editing); expert screens on mock fallback</w:t>
+              <w:t>Web leftovers (heating relay field, Zalo/SMS options); expert screens on mock fallback</w:t>
             </w:r>
           </w:p>
         </w:tc>

</xml_diff>

<commit_message>
docs(srs): align SRS 3.1.0, SDD 1.1.0 and the Review 2 forms
- One installation for one owner, no public sign-up (BM03 row 10);
  alert renames MISTING_INEFFECTIVE / UNEXPECTED_RESTART, 30-min pump
  override with confirmation, per-relay expiry (BM03 row 11)
- SRS: breach dwell (BR-34), command freshness (BR-35), retention (BR-36),
  health rules BR-28..31 with server-side rating blinding and one rating
  state per assessor (6.18), NFR thresholds set, NFR-09 split into
  detection and counting, NFR-10 d/e, MARKET-FR renamed HARVEST-FR
- SDD: device topics and per-device broker credential (D3), D15, D16,
  final ERD, retention, migrations, constants map; no "planned" marks,
  gaps moved to Project Tracking
- Project Tracking is the single status source (gaps G-01..G-19)
- Report 5: 136 cases, verified/traced coverage, Jest, PlatformIO and
  pytest results from CI; BM01 fits 4 pages; registration numbering
</commit_message>
<xml_diff>
--- a/docs/reports/design-brief/SWP490_R2_BM01_Design_Brief_SwiftletCare.docx
+++ b/docs/reports/design-brief/SWP490_R2_BM01_Design_Brief_SwiftletCare.docx
@@ -460,7 +460,7 @@
                 <w:sz w:val="19"/>
                 <w:szCs w:val="19"/>
               </w:rPr>
-              <w:t>1.0 (registration v3, SRS 3.0.0, SDD 1.0.9)</w:t>
+              <w:t>1.1 (registration v3, BM03 1.1, SRS 3.1.0, SDD 1.1.0)</w:t>
             </w:r>
           </w:p>
         </w:tc>
@@ -526,7 +526,7 @@
                 <w:sz w:val="19"/>
                 <w:szCs w:val="19"/>
               </w:rPr>
-              <w:t>23/10/2026</w:t>
+              <w:t>26/10/2026</w:t>
             </w:r>
           </w:p>
         </w:tc>
@@ -841,7 +841,7 @@
                 <w:sz w:val="19"/>
                 <w:szCs w:val="19"/>
               </w:rPr>
-              <w:t>Birds leave the hole in every direction (Iteration 1 clips)</w:t>
+              <w:t>Birds leave the hole in every direction</w:t>
             </w:r>
           </w:p>
         </w:tc>
@@ -874,7 +874,7 @@
                 <w:sz w:val="19"/>
                 <w:szCs w:val="19"/>
               </w:rPr>
-              <w:t>C.2, C.4, D</w:t>
+              <w:t>B, C, D, 4</w:t>
             </w:r>
           </w:p>
         </w:tc>
@@ -905,7 +905,7 @@
                 <w:sz w:val="19"/>
                 <w:szCs w:val="19"/>
               </w:rPr>
-              <w:t>Technician installs on tickets</w:t>
+              <w:t>Technician installs on tickets; public sign-up</w:t>
             </w:r>
           </w:p>
         </w:tc>
@@ -936,7 +936,7 @@
                 <w:sz w:val="19"/>
                 <w:szCs w:val="19"/>
               </w:rPr>
-              <w:t>Flow 10: owner sets up by QR; no tickets; Technician on devices only</w:t>
+              <w:t>Owner sets up by QR (Flow 10); one owner per installation; no tickets, no sign-up</w:t>
             </w:r>
           </w:p>
         </w:tc>
@@ -967,7 +967,7 @@
                 <w:sz w:val="19"/>
                 <w:szCs w:val="19"/>
               </w:rPr>
-              <w:t>Review 1: simple setup; "platform, not system"</w:t>
+              <w:t>Review 1: system, not platform</w:t>
             </w:r>
           </w:p>
         </w:tc>
@@ -1062,7 +1062,7 @@
                 <w:sz w:val="19"/>
                 <w:szCs w:val="19"/>
               </w:rPr>
-              <w:t>Flow 11: daily status per house, reports with PDF/CSV, ratings</w:t>
+              <w:t>Daily status per house, reports, PDF/CSV, ratings (Flow 11); rule-based indicator</w:t>
             </w:r>
           </w:p>
         </w:tc>
@@ -1157,7 +1157,7 @@
                 <w:sz w:val="19"/>
                 <w:szCs w:val="19"/>
               </w:rPr>
-              <w:t>No weather, no load current</w:t>
+              <w:t>No weather or load current; "pump dry", "power loss"</w:t>
             </w:r>
           </w:p>
         </w:tc>
@@ -1188,7 +1188,7 @@
                 <w:sz w:val="19"/>
                 <w:szCs w:val="19"/>
               </w:rPr>
-              <w:t>Weather API as context; current sensing on pump and fan</w:t>
+              <w:t>Weather as context; pump and fan current; "misting ineffective", "unexpected restart"</w:t>
             </w:r>
           </w:p>
         </w:tc>
@@ -1219,7 +1219,7 @@
                 <w:sz w:val="19"/>
                 <w:szCs w:val="19"/>
               </w:rPr>
-              <w:t>Explain low return rates; detect dead loads</w:t>
+              <w:t>No unmeasured cause claimed</w:t>
             </w:r>
           </w:p>
         </w:tc>
@@ -1283,7 +1283,7 @@
                 <w:sz w:val="19"/>
                 <w:szCs w:val="19"/>
               </w:rPr>
-              <w:t>Bypass switches; Telegram or push; predator extension</w:t>
+              <w:t>Bypass; Telegram or push; predator; any override length</w:t>
             </w:r>
           </w:p>
         </w:tc>
@@ -1314,7 +1314,7 @@
                 <w:sz w:val="19"/>
                 <w:szCs w:val="19"/>
               </w:rPr>
-              <w:t>No bypass; Telegram and push; no predator detection</w:t>
+              <w:t>No bypass; Telegram and push; no predator; pump ON ≤ 30 min</w:t>
             </w:r>
           </w:p>
         </w:tc>
@@ -1345,7 +1345,7 @@
                 <w:sz w:val="19"/>
                 <w:szCs w:val="19"/>
               </w:rPr>
-              <w:t>Borrowed house cannot be rewired; team; Review 1</w:t>
+              <w:t>Borrowed house; Review 1; safety</w:t>
             </w:r>
           </w:p>
         </w:tc>
@@ -1513,7 +1513,7 @@
                 <w:sz w:val="19"/>
                 <w:szCs w:val="19"/>
               </w:rPr>
-              <w:t>One vision class; dB-only sensor; no equipment or established limits</w:t>
+              <w:t>One vision class; dB-only sensor; no equipment or limits</w:t>
             </w:r>
           </w:p>
         </w:tc>
@@ -1546,7 +1546,7 @@
                 <w:sz w:val="19"/>
                 <w:szCs w:val="19"/>
               </w:rPr>
-              <w:t>Marketplace, buyer role, tickets, SLA, regions, Zalo/SMS, bypass switches, 24/7 production</w:t>
+              <w:t>Marketplace, buyer, tickets, SLA, regions, public sign-up, several owners per installation, Zalo/SMS, bypass, 24/7 production</w:t>
             </w:r>
           </w:p>
         </w:tc>
@@ -1577,7 +1577,7 @@
                 <w:sz w:val="19"/>
                 <w:szCs w:val="19"/>
               </w:rPr>
-              <w:t>Removed after Review 1 (platform functions); borrowed house; prototype and staging only</w:t>
+              <w:t>Platform functions (Review 1); borrowed house; prototype only</w:t>
             </w:r>
           </w:p>
         </w:tc>
@@ -1605,7 +1605,7 @@
         <w:spacing w:after="60"/>
       </w:pPr>
       <w:r>
-        <w:t>Swiftlet houses are closed buildings that owners visit every few days, so humidity drift, equipment faults and a falling flock go unnoticed. SwiftletCare lets the house regulate and watch itself. On each floor an ESP32 controller reads five RS485 sensors and drives misting, fan and speaker with fuzzy logic, even without Internet. A PC reads the entrance camera, counts birds (YOLO + ByteTrack) and streams annotated video. A cloud backend raises alerts, forecasts breaches and gives every house one daily health status combining environment, air quality, return rate and noise by agreement. The Farm Owner monitors, overrides and sets up devices by QR code; a Domain Expert validates inferred alerts and tunes parameters; Technician and Administrator support them. Architecture: SDD 2.1; deployment: SDD 11.</w:t>
+        <w:t>Owners visit their closed swiftlet houses every few days, so humidity drift, equipment faults and a falling flock go unnoticed. SwiftletCare, installed for one owner's houses, lets each house regulate and watch itself. On each floor an ESP32 reads five RS485 sensors and drives misting, fan and speaker with fuzzy logic, even offline. A PC counts birds at the entrance camera (YOLO + ByteTrack) and streams annotated video. A cloud backend raises alerts, forecasts breaches and gives each house a daily rule-based health status from environment, air, return rate and noise. The Farm Owner monitors, overrides and sets up devices by QR; a Domain Expert validates and tunes; Technician and Administrator support them. Architecture: SDD 2.1; deployment: SDD 11.</w:t>
       </w:r>
     </w:p>
     <w:p>
@@ -1943,7 +1943,7 @@
                 <w:sz w:val="19"/>
                 <w:szCs w:val="19"/>
               </w:rPr>
-              <w:t>Cloud commands; on the controller</w:t>
+              <w:t>Cloud; controller</w:t>
             </w:r>
           </w:p>
         </w:tc>
@@ -1974,7 +1974,7 @@
                 <w:sz w:val="19"/>
                 <w:szCs w:val="19"/>
               </w:rPr>
-              <w:t>Controller decides every 10 s; the cloud only configures, so control survives outages</w:t>
+              <w:t>Controller decides every 10 s; cloud only configures, so control survives outages</w:t>
             </w:r>
           </w:p>
         </w:tc>
@@ -2036,7 +2036,7 @@
                 <w:sz w:val="19"/>
                 <w:szCs w:val="19"/>
               </w:rPr>
-              <w:t>ENV-FR-010, 014; AD-01, AD-03</w:t>
+              <w:t>ENV-FR-010, 014; AD-01, 03</w:t>
             </w:r>
           </w:p>
         </w:tc>
@@ -2131,7 +2131,7 @@
                 <w:sz w:val="19"/>
                 <w:szCs w:val="19"/>
               </w:rPr>
-              <w:t>Line; ring near the hole; ring + whole-frame tracking</w:t>
+              <w:t>Line; ring near hole; ring + whole-frame tracking</w:t>
             </w:r>
           </w:p>
         </w:tc>
@@ -2162,7 +2162,7 @@
                 <w:sz w:val="19"/>
                 <w:szCs w:val="19"/>
               </w:rPr>
-              <w:t>Whole-frame tracking + ring + extrapolation: a bird at the hole is a 1–2-frame blur</w:t>
+              <w:t>Whole-frame tracking, ring, extrapolation: at the hole a bird is a 1–2-frame blur</w:t>
             </w:r>
           </w:p>
         </w:tc>
@@ -2319,7 +2319,7 @@
                 <w:sz w:val="19"/>
                 <w:szCs w:val="19"/>
               </w:rPr>
-              <w:t>Approval blocks changes; no review</w:t>
+              <w:t>Approval blocks; no review</w:t>
             </w:r>
           </w:p>
         </w:tc>
@@ -2476,7 +2476,7 @@
                 <w:sz w:val="19"/>
                 <w:szCs w:val="19"/>
               </w:rPr>
-              <w:t>Device identity and setup</w:t>
+              <w:t>Device identity</w:t>
             </w:r>
           </w:p>
         </w:tc>
@@ -2507,7 +2507,7 @@
                 <w:sz w:val="19"/>
                 <w:szCs w:val="19"/>
               </w:rPr>
-              <w:t>Typed IDs; display/BLE; label + floor QR</w:t>
+              <w:t>Typed IDs; BLE; label + floor QR; zone or device topics</w:t>
             </w:r>
           </w:p>
         </w:tc>
@@ -2538,7 +2538,7 @@
                 <w:sz w:val="19"/>
                 <w:szCs w:val="19"/>
               </w:rPr>
-              <w:t>Label (ID + key) and floor QR; key checked by the backend; zone sent at first heartbeat</w:t>
+              <w:t>Label and floor QR; one credential and topic tree per device; zone kept by the backend</w:t>
             </w:r>
           </w:p>
         </w:tc>
@@ -2600,7 +2600,7 @@
                 <w:sz w:val="19"/>
                 <w:szCs w:val="19"/>
               </w:rPr>
-              <w:t>FARM-FR-003, 010, 011; SM-16, AD-10</w:t>
+              <w:t>FARM-FR-003c, 010; SDD D3; AD-10</w:t>
             </w:r>
           </w:p>
         </w:tc>
@@ -2695,7 +2695,7 @@
                 <w:sz w:val="19"/>
                 <w:szCs w:val="19"/>
               </w:rPr>
-              <w:t>Weighted score; classifier; agreement rules</w:t>
+              <w:t>Weighted score; classifier; rules</w:t>
             </w:r>
           </w:p>
         </w:tc>
@@ -2726,7 +2726,7 @@
                 <w:sz w:val="19"/>
                 <w:szCs w:val="19"/>
               </w:rPr>
-              <w:t>Rules: ACTION needs the flock plus another source; reasons listed; judged against ratings</w:t>
+              <w:t>Agreement rules: ACTION needs the flock plus another source; reasons listed</w:t>
             </w:r>
           </w:p>
         </w:tc>
@@ -2788,7 +2788,7 @@
                 <w:sz w:val="19"/>
                 <w:szCs w:val="19"/>
               </w:rPr>
-              <w:t>ANALYTICS-FR-012; SM-17, AD-14</w:t>
+              <w:t>ANALYTICS-FR-012; AD-14</w:t>
             </w:r>
           </w:p>
         </w:tc>
@@ -3059,7 +3059,7 @@
                 <w:sz w:val="19"/>
                 <w:szCs w:val="19"/>
               </w:rPr>
-              <w:t>No trained swiftlet model; spare PC may not reach 25 fps (≈ 7–12 fps on a laptop)</w:t>
+              <w:t>No trained model; PC may not keep up with 25 fps (7–12 fps on a laptop)</w:t>
             </w:r>
           </w:p>
         </w:tc>
@@ -3090,7 +3090,7 @@
                 <w:sz w:val="19"/>
                 <w:szCs w:val="19"/>
               </w:rPr>
-              <w:t>WF-06, WF-11 miss NFR-04/09</w:t>
+              <w:t>NFR-04/09 fail</w:t>
             </w:r>
           </w:p>
         </w:tc>
@@ -3121,7 +3121,7 @@
                 <w:sz w:val="19"/>
                 <w:szCs w:val="19"/>
               </w:rPr>
-              <w:t>Train on 3 recorded days; measure on the PC in It. 2; else smaller input, demo on clips</w:t>
+              <w:t>Train by recording day; measure on the PC; else lower camera rate, re-measure NFR-09</w:t>
             </w:r>
           </w:p>
         </w:tc>
@@ -3247,7 +3247,7 @@
                 <w:sz w:val="19"/>
                 <w:szCs w:val="19"/>
               </w:rPr>
-              <w:t>Health output not shown or measured</w:t>
+              <w:t>Health not measured</w:t>
             </w:r>
           </w:p>
         </w:tc>
@@ -3278,7 +3278,7 @@
                 <w:sz w:val="19"/>
                 <w:szCs w:val="19"/>
               </w:rPr>
-              <w:t>Daily job first against seeded days; start field run at installation</w:t>
+              <w:t>Daily job first on seeded days; field run from installation</w:t>
             </w:r>
           </w:p>
         </w:tc>
@@ -3373,7 +3373,7 @@
                 <w:sz w:val="19"/>
                 <w:szCs w:val="19"/>
               </w:rPr>
-              <w:t>No staging yet; firmware has no MQTT TLS</w:t>
+              <w:t>No staging; MQTT moves to device topics, esp-mqtt, TLS</w:t>
             </w:r>
           </w:p>
         </w:tc>
@@ -3404,7 +3404,7 @@
                 <w:sz w:val="19"/>
                 <w:szCs w:val="19"/>
               </w:rPr>
-              <w:t>Demos must run on staging</w:t>
+              <w:t>Demos need staging</w:t>
             </w:r>
           </w:p>
         </w:tc>
@@ -3435,7 +3435,7 @@
                 <w:sz w:val="19"/>
                 <w:szCs w:val="19"/>
               </w:rPr>
-              <w:t>Staging and demo seed in It. 2; TLS in 2 days, else authenticated 1883 as a limitation</w:t>
+              <w:t>Staging first in It. 2; one firmware-backend-AI PR, bench-tested</w:t>
             </w:r>
           </w:p>
         </w:tc>
@@ -3740,7 +3740,7 @@
                 <w:sz w:val="19"/>
                 <w:szCs w:val="19"/>
               </w:rPr>
-              <w:t>G1</w:t>
+              <w:t>G-01, 14</w:t>
             </w:r>
           </w:p>
         </w:tc>
@@ -3771,7 +3771,7 @@
                 <w:sz w:val="19"/>
                 <w:szCs w:val="19"/>
               </w:rPr>
-              <w:t>Roles per SRS 2.4; tickets, SLA and regions removed</w:t>
+              <w:t>Alert-type renames, DISMISSED, new types; predator, Zalo/SMS, heating left; data model behind SDD 6.1</w:t>
             </w:r>
           </w:p>
         </w:tc>
@@ -3802,7 +3802,7 @@
                 <w:sz w:val="19"/>
                 <w:szCs w:val="19"/>
               </w:rPr>
-              <w:t>backend, clients</w:t>
+              <w:t>all modules</w:t>
             </w:r>
           </w:p>
         </w:tc>
@@ -3833,7 +3833,7 @@
                 <w:sz w:val="19"/>
                 <w:szCs w:val="19"/>
               </w:rPr>
-              <w:t>Closed: PR #100–#106</w:t>
+              <w:t>One enum PR with migration, then SDD 6.4</w:t>
             </w:r>
           </w:p>
         </w:tc>
@@ -3895,7 +3895,7 @@
                 <w:sz w:val="19"/>
                 <w:szCs w:val="19"/>
               </w:rPr>
-              <w:t>Done</w:t>
+              <w:t>Tag; It. 2</w:t>
             </w:r>
           </w:p>
         </w:tc>
@@ -3928,7 +3928,7 @@
                 <w:sz w:val="19"/>
                 <w:szCs w:val="19"/>
               </w:rPr>
-              <w:t>G2</w:t>
+              <w:t>G-02, 09, 10, 16</w:t>
             </w:r>
           </w:p>
         </w:tc>
@@ -3959,7 +3959,7 @@
                 <w:sz w:val="19"/>
                 <w:szCs w:val="19"/>
               </w:rPr>
-              <w:t>DISMISSED, alert evidence, owner fallback (BR-22), review items, proposals</w:t>
+              <w:t>Public sign-up open (removed before the tag); QR setup screens; FCM only logged; mobile a scaffold</w:t>
             </w:r>
           </w:p>
         </w:tc>
@@ -3990,7 +3990,7 @@
                 <w:sz w:val="19"/>
                 <w:szCs w:val="19"/>
               </w:rPr>
-              <w:t>backend, web</w:t>
+              <w:t>backend, web, mobile</w:t>
             </w:r>
           </w:p>
         </w:tc>
@@ -4021,7 +4021,7 @@
                 <w:sz w:val="19"/>
                 <w:szCs w:val="19"/>
               </w:rPr>
-              <w:t>Per SM-01, 10, 11</w:t>
+              <w:t>AUTH-FR-005c; AD-10; ALERT-FR-002; SDD 5.4</w:t>
             </w:r>
           </w:p>
         </w:tc>
@@ -4052,7 +4052,7 @@
                 <w:sz w:val="19"/>
                 <w:szCs w:val="19"/>
               </w:rPr>
-              <w:t>Thái Minh Tuấn</w:t>
+              <w:t>Trần Minh Kiệt</w:t>
             </w:r>
           </w:p>
         </w:tc>
@@ -4083,7 +4083,7 @@
                 <w:sz w:val="19"/>
                 <w:szCs w:val="19"/>
               </w:rPr>
-              <w:t>It. 2</w:t>
+              <w:t>Tag; It. 2–3</w:t>
             </w:r>
           </w:p>
         </w:tc>
@@ -4116,7 +4116,7 @@
                 <w:sz w:val="19"/>
                 <w:szCs w:val="19"/>
               </w:rPr>
-              <w:t>G3</w:t>
+              <w:t>G-03, 04, 15</w:t>
             </w:r>
           </w:p>
         </w:tc>
@@ -4147,7 +4147,7 @@
                 <w:sz w:val="19"/>
                 <w:szCs w:val="19"/>
               </w:rPr>
-              <w:t>Config version, CONFIG_MISMATCH; actuator current check</w:t>
+              <w:t>DISMISSED, owner fallback and notices, evidence, review items, proposals; expert screens on mock data</w:t>
             </w:r>
           </w:p>
         </w:tc>
@@ -4178,7 +4178,7 @@
                 <w:sz w:val="19"/>
                 <w:szCs w:val="19"/>
               </w:rPr>
-              <w:t>firmware, backend</w:t>
+              <w:t>backend, web</w:t>
             </w:r>
           </w:p>
         </w:tc>
@@ -4209,7 +4209,7 @@
                 <w:sz w:val="19"/>
                 <w:szCs w:val="19"/>
               </w:rPr>
-              <w:t>Version in heartbeat; ADS1115</w:t>
+              <w:t>SM-01, 10, 11</w:t>
             </w:r>
           </w:p>
         </w:tc>
@@ -4240,7 +4240,7 @@
                 <w:sz w:val="19"/>
                 <w:szCs w:val="19"/>
               </w:rPr>
-              <w:t>Nguyễn Chí Bảo</w:t>
+              <w:t>Thái Minh Tuấn</w:t>
             </w:r>
           </w:p>
         </w:tc>
@@ -4271,7 +4271,7 @@
                 <w:sz w:val="19"/>
                 <w:szCs w:val="19"/>
               </w:rPr>
-              <w:t>It. 2–3</w:t>
+              <w:t>It. 2</w:t>
             </w:r>
           </w:p>
         </w:tc>
@@ -4304,7 +4304,7 @@
                 <w:sz w:val="19"/>
                 <w:szCs w:val="19"/>
               </w:rPr>
-              <w:t>G4</w:t>
+              <w:t>G-05, 06</w:t>
             </w:r>
           </w:p>
         </w:tc>
@@ -4335,7 +4335,7 @@
                 <w:sz w:val="19"/>
                 <w:szCs w:val="19"/>
               </w:rPr>
-              <w:t>Pipeline not run on staging; sessions from buckets</w:t>
+              <w:t>Breach without dwell; one override expiry per controller, no pump limit or confirmation</w:t>
             </w:r>
           </w:p>
         </w:tc>
@@ -4366,7 +4366,7 @@
                 <w:sz w:val="19"/>
                 <w:szCs w:val="19"/>
               </w:rPr>
-              <w:t>ai-pipeline, backend</w:t>
+              <w:t>backend, firmware, web</w:t>
             </w:r>
           </w:p>
         </w:tc>
@@ -4397,7 +4397,7 @@
                 <w:sz w:val="19"/>
                 <w:szCs w:val="19"/>
               </w:rPr>
-              <w:t>Run on the AI node PC</w:t>
+              <w:t>BR-34, BR-08, 20, 35</w:t>
             </w:r>
           </w:p>
         </w:tc>
@@ -4428,7 +4428,7 @@
                 <w:sz w:val="19"/>
                 <w:szCs w:val="19"/>
               </w:rPr>
-              <w:t>Nguyễn Chí Bảo</w:t>
+              <w:t>Nguyễn Vũ Len</w:t>
             </w:r>
           </w:p>
         </w:tc>
@@ -4492,7 +4492,7 @@
                 <w:sz w:val="19"/>
                 <w:szCs w:val="19"/>
               </w:rPr>
-              <w:t>G5</w:t>
+              <w:t>G-07, 08</w:t>
             </w:r>
           </w:p>
         </w:tc>
@@ -4523,7 +4523,7 @@
                 <w:sz w:val="19"/>
                 <w:szCs w:val="19"/>
               </w:rPr>
-              <w:t>Daily status, ratings, house reports, PDF/CSV, weather</w:t>
+              <w:t>Zone topics, shared credential, QoS 0, no TLS on the ESP32; no configuration version</w:t>
             </w:r>
           </w:p>
         </w:tc>
@@ -4554,7 +4554,7 @@
                 <w:sz w:val="19"/>
                 <w:szCs w:val="19"/>
               </w:rPr>
-              <w:t>backend, web</w:t>
+              <w:t>firmware, backend, AI node</w:t>
             </w:r>
           </w:p>
         </w:tc>
@@ -4585,7 +4585,7 @@
                 <w:sz w:val="19"/>
                 <w:szCs w:val="19"/>
               </w:rPr>
-              <w:t>SDD 6.4, AD-14</w:t>
+              <w:t>SDD D3, 7.2; SM-12</w:t>
             </w:r>
           </w:p>
         </w:tc>
@@ -4616,7 +4616,7 @@
                 <w:sz w:val="19"/>
                 <w:szCs w:val="19"/>
               </w:rPr>
-              <w:t>Nguyễn Thị Yến Nhi</w:t>
+              <w:t>Nguyễn Chí Bảo</w:t>
             </w:r>
           </w:p>
         </w:tc>
@@ -4647,7 +4647,7 @@
                 <w:sz w:val="19"/>
                 <w:szCs w:val="19"/>
               </w:rPr>
-              <w:t>It. 2–3</w:t>
+              <w:t>It. 2</w:t>
             </w:r>
           </w:p>
         </w:tc>
@@ -4680,7 +4680,7 @@
                 <w:sz w:val="19"/>
                 <w:szCs w:val="19"/>
               </w:rPr>
-              <w:t>G6</w:t>
+              <w:t>G-11</w:t>
             </w:r>
           </w:p>
         </w:tc>
@@ -4711,7 +4711,7 @@
                 <w:sz w:val="19"/>
                 <w:szCs w:val="19"/>
               </w:rPr>
-              <w:t>QR setup, labels, progress; FCM push; staging, demo seed</w:t>
+              <w:t>Daily status, ratings with snapshot, house reports, PDF/CSV, weather, evaluation</w:t>
             </w:r>
           </w:p>
         </w:tc>
@@ -4742,7 +4742,7 @@
                 <w:sz w:val="19"/>
                 <w:szCs w:val="19"/>
               </w:rPr>
-              <w:t>mobile, backend, deploy</w:t>
+              <w:t>backend, web, mobile</w:t>
             </w:r>
           </w:p>
         </w:tc>
@@ -4773,7 +4773,7 @@
                 <w:sz w:val="19"/>
                 <w:szCs w:val="19"/>
               </w:rPr>
-              <w:t>expo-camera; Firebase; staging.md</w:t>
+              <w:t>SM-17, AD-14</w:t>
             </w:r>
           </w:p>
         </w:tc>
@@ -4804,7 +4804,7 @@
                 <w:sz w:val="19"/>
                 <w:szCs w:val="19"/>
               </w:rPr>
-              <w:t>Trần Minh Kiệt</w:t>
+              <w:t>Nguyễn Thị Yến Nhi</w:t>
             </w:r>
           </w:p>
         </w:tc>
@@ -4835,7 +4835,7 @@
                 <w:sz w:val="19"/>
                 <w:szCs w:val="19"/>
               </w:rPr>
-              <w:t>It. 2</w:t>
+              <w:t>It. 2–3</w:t>
             </w:r>
           </w:p>
         </w:tc>
@@ -4868,7 +4868,7 @@
                 <w:sz w:val="19"/>
                 <w:szCs w:val="19"/>
               </w:rPr>
-              <w:t>G7</w:t>
+              <w:t>G-12, 13</w:t>
             </w:r>
           </w:p>
         </w:tc>
@@ -4899,7 +4899,7 @@
                 <w:sz w:val="19"/>
                 <w:szCs w:val="19"/>
               </w:rPr>
-              <w:t>Web leftovers (heating relay field, Zalo/SMS options); expert screens on mock fallback</w:t>
+              <w:t>No trained model; sessions from buckets; ring editor; current sensing</w:t>
             </w:r>
           </w:p>
         </w:tc>
@@ -4930,7 +4930,7 @@
                 <w:sz w:val="19"/>
                 <w:szCs w:val="19"/>
               </w:rPr>
-              <w:t>frontend</w:t>
+              <w:t>AI node, backend, web, board</w:t>
             </w:r>
           </w:p>
         </w:tc>
@@ -4961,7 +4961,7 @@
                 <w:sz w:val="19"/>
                 <w:szCs w:val="19"/>
               </w:rPr>
-              <w:t>Remove; wire to API</w:t>
+              <w:t>VISION-FR-008…020; THREAT-FR-014</w:t>
             </w:r>
           </w:p>
         </w:tc>
@@ -4992,7 +4992,195 @@
                 <w:sz w:val="19"/>
                 <w:szCs w:val="19"/>
               </w:rPr>
-              <w:t>Nguyễn Vũ Len</w:t>
+              <w:t>Nguyễn Chí Bảo</w:t>
+            </w:r>
+          </w:p>
+        </w:tc>
+        <w:tc>
+          <w:tcPr>
+            <w:tcW w:type="dxa" w:w="1287"/>
+            <w:tcBorders>
+              <w:top w:val="single" w:color="D9D4CA" w:sz="4"/>
+              <w:left w:val="single" w:color="D9D4CA" w:sz="4"/>
+              <w:bottom w:val="single" w:color="D9D4CA" w:sz="4"/>
+              <w:right w:val="single" w:color="D9D4CA" w:sz="4"/>
+            </w:tcBorders>
+            <w:tcMar>
+              <w:top w:type="dxa" w:w="60"/>
+              <w:left w:type="dxa" w:w="80"/>
+              <w:bottom w:type="dxa" w:w="60"/>
+              <w:right w:type="dxa" w:w="80"/>
+            </w:tcMar>
+          </w:tcPr>
+          <w:p>
+            <w:r>
+              <w:rPr>
+                <w:rFonts w:ascii="Calibri" w:cs="Calibri" w:eastAsia="Calibri" w:hAnsi="Calibri"/>
+                <w:b w:val="false"/>
+                <w:bCs w:val="false"/>
+                <w:i w:val="0"/>
+                <w:iCs w:val="false"/>
+                <w:sz w:val="19"/>
+                <w:szCs w:val="19"/>
+              </w:rPr>
+              <w:t>It. 2–3</w:t>
+            </w:r>
+          </w:p>
+        </w:tc>
+      </w:tr>
+      <w:tr>
+        <w:tc>
+          <w:tcPr>
+            <w:tcW w:type="dxa" w:w="642"/>
+            <w:tcBorders>
+              <w:top w:val="single" w:color="D9D4CA" w:sz="4"/>
+              <w:left w:val="single" w:color="D9D4CA" w:sz="4"/>
+              <w:bottom w:val="single" w:color="D9D4CA" w:sz="4"/>
+              <w:right w:val="single" w:color="D9D4CA" w:sz="4"/>
+            </w:tcBorders>
+            <w:tcMar>
+              <w:top w:type="dxa" w:w="60"/>
+              <w:left w:type="dxa" w:w="80"/>
+              <w:bottom w:type="dxa" w:w="60"/>
+              <w:right w:type="dxa" w:w="80"/>
+            </w:tcMar>
+          </w:tcPr>
+          <w:p>
+            <w:r>
+              <w:rPr>
+                <w:rFonts w:ascii="Calibri" w:cs="Calibri" w:eastAsia="Calibri" w:hAnsi="Calibri"/>
+                <w:b w:val="false"/>
+                <w:bCs w:val="false"/>
+                <w:i w:val="0"/>
+                <w:iCs w:val="false"/>
+                <w:sz w:val="19"/>
+                <w:szCs w:val="19"/>
+              </w:rPr>
+              <w:t>G-17</w:t>
+            </w:r>
+          </w:p>
+        </w:tc>
+        <w:tc>
+          <w:tcPr>
+            <w:tcW w:type="dxa" w:w="2570"/>
+            <w:tcBorders>
+              <w:top w:val="single" w:color="D9D4CA" w:sz="4"/>
+              <w:left w:val="single" w:color="D9D4CA" w:sz="4"/>
+              <w:bottom w:val="single" w:color="D9D4CA" w:sz="4"/>
+              <w:right w:val="single" w:color="D9D4CA" w:sz="4"/>
+            </w:tcBorders>
+            <w:tcMar>
+              <w:top w:type="dxa" w:w="60"/>
+              <w:left w:type="dxa" w:w="80"/>
+              <w:bottom w:type="dxa" w:w="60"/>
+              <w:right w:type="dxa" w:w="80"/>
+            </w:tcMar>
+          </w:tcPr>
+          <w:p>
+            <w:r>
+              <w:rPr>
+                <w:rFonts w:ascii="Calibri" w:cs="Calibri" w:eastAsia="Calibri" w:hAnsi="Calibri"/>
+                <w:b w:val="false"/>
+                <w:bCs w:val="false"/>
+                <w:i w:val="0"/>
+                <w:iCs w:val="false"/>
+                <w:sz w:val="19"/>
+                <w:szCs w:val="19"/>
+              </w:rPr>
+              <w:t>Staging, TLS proxy, demo seed</w:t>
+            </w:r>
+          </w:p>
+        </w:tc>
+        <w:tc>
+          <w:tcPr>
+            <w:tcW w:type="dxa" w:w="1927"/>
+            <w:tcBorders>
+              <w:top w:val="single" w:color="D9D4CA" w:sz="4"/>
+              <w:left w:val="single" w:color="D9D4CA" w:sz="4"/>
+              <w:bottom w:val="single" w:color="D9D4CA" w:sz="4"/>
+              <w:right w:val="single" w:color="D9D4CA" w:sz="4"/>
+            </w:tcBorders>
+            <w:tcMar>
+              <w:top w:type="dxa" w:w="60"/>
+              <w:left w:type="dxa" w:w="80"/>
+              <w:bottom w:type="dxa" w:w="60"/>
+              <w:right w:type="dxa" w:w="80"/>
+            </w:tcMar>
+          </w:tcPr>
+          <w:p>
+            <w:r>
+              <w:rPr>
+                <w:rFonts w:ascii="Calibri" w:cs="Calibri" w:eastAsia="Calibri" w:hAnsi="Calibri"/>
+                <w:b w:val="false"/>
+                <w:bCs w:val="false"/>
+                <w:i w:val="0"/>
+                <w:iCs w:val="false"/>
+                <w:sz w:val="19"/>
+                <w:szCs w:val="19"/>
+              </w:rPr>
+              <w:t>deploy</w:t>
+            </w:r>
+          </w:p>
+        </w:tc>
+        <w:tc>
+          <w:tcPr>
+            <w:tcW w:type="dxa" w:w="1927"/>
+            <w:tcBorders>
+              <w:top w:val="single" w:color="D9D4CA" w:sz="4"/>
+              <w:left w:val="single" w:color="D9D4CA" w:sz="4"/>
+              <w:bottom w:val="single" w:color="D9D4CA" w:sz="4"/>
+              <w:right w:val="single" w:color="D9D4CA" w:sz="4"/>
+            </w:tcBorders>
+            <w:tcMar>
+              <w:top w:type="dxa" w:w="60"/>
+              <w:left w:type="dxa" w:w="80"/>
+              <w:bottom w:type="dxa" w:w="60"/>
+              <w:right w:type="dxa" w:w="80"/>
+            </w:tcMar>
+          </w:tcPr>
+          <w:p>
+            <w:r>
+              <w:rPr>
+                <w:rFonts w:ascii="Calibri" w:cs="Calibri" w:eastAsia="Calibri" w:hAnsi="Calibri"/>
+                <w:b w:val="false"/>
+                <w:bCs w:val="false"/>
+                <w:i w:val="0"/>
+                <w:iCs w:val="false"/>
+                <w:sz w:val="19"/>
+                <w:szCs w:val="19"/>
+              </w:rPr>
+              <w:t>SDD 3.4, 11</w:t>
+            </w:r>
+          </w:p>
+        </w:tc>
+        <w:tc>
+          <w:tcPr>
+            <w:tcW w:type="dxa" w:w="1285"/>
+            <w:tcBorders>
+              <w:top w:val="single" w:color="D9D4CA" w:sz="4"/>
+              <w:left w:val="single" w:color="D9D4CA" w:sz="4"/>
+              <w:bottom w:val="single" w:color="D9D4CA" w:sz="4"/>
+              <w:right w:val="single" w:color="D9D4CA" w:sz="4"/>
+            </w:tcBorders>
+            <w:tcMar>
+              <w:top w:type="dxa" w:w="60"/>
+              <w:left w:type="dxa" w:w="80"/>
+              <w:bottom w:type="dxa" w:w="60"/>
+              <w:right w:type="dxa" w:w="80"/>
+            </w:tcMar>
+          </w:tcPr>
+          <w:p>
+            <w:r>
+              <w:rPr>
+                <w:rFonts w:ascii="Calibri" w:cs="Calibri" w:eastAsia="Calibri" w:hAnsi="Calibri"/>
+                <w:b w:val="false"/>
+                <w:bCs w:val="false"/>
+                <w:i w:val="0"/>
+                <w:iCs w:val="false"/>
+                <w:sz w:val="19"/>
+                <w:szCs w:val="19"/>
+              </w:rPr>
+              <w:t>Trần Minh Kiệt</w:t>
             </w:r>
           </w:p>
         </w:tc>
@@ -5034,7 +5222,7 @@
         <w:spacing w:after="60"/>
       </w:pPr>
       <w:r>
-        <w:t>Full list with FR references: docs/reports/README.md and SDD Section 12. High findings of the self-review (BM02) marked Kept or Planned are added here after the prompt is run.</w:t>
+        <w:t>Each gap with its requirements: Project Tracking, Section 6 (G-01…G-19). High findings of the self-review (BM02) marked Kept or Planned are added here after the prompt is run.</w:t>
       </w:r>
     </w:p>
     <w:p>
@@ -5336,7 +5524,7 @@
                 <w:sz w:val="19"/>
                 <w:szCs w:val="19"/>
               </w:rPr>
-              <w:t>Telemetry, live dashboard</w:t>
+              <w:t>Telemetry, dashboard</w:t>
             </w:r>
           </w:p>
         </w:tc>
@@ -5398,7 +5586,7 @@
                 <w:sz w:val="19"/>
                 <w:szCs w:val="19"/>
               </w:rPr>
-              <w:t>Read every 1 s; on the dashboard ≤ 2 s; dead sensor shown stale; no event to other farms</w:t>
+              <w:t>On the dashboard ≤ 2 s; dead sensor stale; no event to other farms</w:t>
             </w:r>
           </w:p>
         </w:tc>
@@ -5429,7 +5617,7 @@
                 <w:sz w:val="19"/>
                 <w:szCs w:val="19"/>
               </w:rPr>
-              <w:t>TC-F01-01..03</w:t>
+              <w:t>TC-F01</w:t>
             </w:r>
           </w:p>
         </w:tc>
@@ -5555,7 +5743,7 @@
                 <w:sz w:val="19"/>
                 <w:szCs w:val="19"/>
               </w:rPr>
-              <w:t>FO (auto)</w:t>
+              <w:t>auto</w:t>
             </w:r>
           </w:p>
         </w:tc>
@@ -5586,7 +5774,7 @@
                 <w:sz w:val="19"/>
                 <w:szCs w:val="19"/>
               </w:rPr>
-              <w:t>Decision every 10 s ± 1 s; firmware = backend (±1 %) on shared cases</w:t>
+              <w:t>Decision every 10 s ± 1 s; firmware = backend on shared cases</w:t>
             </w:r>
           </w:p>
         </w:tc>
@@ -5617,7 +5805,7 @@
                 <w:sz w:val="19"/>
                 <w:szCs w:val="19"/>
               </w:rPr>
-              <w:t>TC-F02-01..03</w:t>
+              <w:t>TC-F02</w:t>
             </w:r>
           </w:p>
         </w:tc>
@@ -5774,7 +5962,7 @@
                 <w:sz w:val="19"/>
                 <w:szCs w:val="19"/>
               </w:rPr>
-              <w:t>Stored with history and sent; out of range 400, nothing stored; Technician/Admin 403</w:t>
+              <w:t>Stored with history, sent; out of range 400; Technician/Admin 403</w:t>
             </w:r>
           </w:p>
         </w:tc>
@@ -5805,7 +5993,7 @@
                 <w:sz w:val="19"/>
                 <w:szCs w:val="19"/>
               </w:rPr>
-              <w:t>TC-F03-01..03</w:t>
+              <w:t>TC-F03</w:t>
             </w:r>
           </w:p>
         </w:tc>
@@ -5931,7 +6119,7 @@
                 <w:sz w:val="19"/>
                 <w:szCs w:val="19"/>
               </w:rPr>
-              <w:t>FO (auto)</w:t>
+              <w:t>auto</w:t>
             </w:r>
           </w:p>
         </w:tc>
@@ -5962,7 +6150,7 @@
                 <w:sz w:val="19"/>
                 <w:szCs w:val="19"/>
               </w:rPr>
-              <w:t>30-min outage: all decisions, 0 samples lost; hang → restart, POWER_OUTAGE</w:t>
+              <w:t>30-min outage: all decisions, 0 samples lost; hang → UNEXPECTED_RESTART</w:t>
             </w:r>
           </w:p>
         </w:tc>
@@ -5993,7 +6181,7 @@
                 <w:sz w:val="19"/>
                 <w:szCs w:val="19"/>
               </w:rPr>
-              <w:t>TC-F04-01..03</w:t>
+              <w:t>TC-F04</w:t>
             </w:r>
           </w:p>
         </w:tc>
@@ -6024,7 +6212,7 @@
                 <w:sz w:val="19"/>
                 <w:szCs w:val="19"/>
               </w:rPr>
-              <w:t>Done</w:t>
+              <w:t>In progress</w:t>
             </w:r>
           </w:p>
         </w:tc>
@@ -6119,7 +6307,7 @@
                 <w:sz w:val="19"/>
                 <w:szCs w:val="19"/>
               </w:rPr>
-              <w:t>FO (auto)</w:t>
+              <w:t>auto</w:t>
             </w:r>
           </w:p>
         </w:tc>
@@ -6150,7 +6338,7 @@
                 <w:sz w:val="19"/>
                 <w:szCs w:val="19"/>
               </w:rPr>
-              <w:t>300 s pump ON without +2 % → PUMP_DRY, misting 0; timeout → SENSOR_FAULT</w:t>
+              <w:t>300 s pump ON, no +2 % → MISTING_INEFFECTIVE; timeout → SENSOR_FAULT</w:t>
             </w:r>
           </w:p>
         </w:tc>
@@ -6181,7 +6369,7 @@
                 <w:sz w:val="19"/>
                 <w:szCs w:val="19"/>
               </w:rPr>
-              <w:t>TC-F05-01..03</w:t>
+              <w:t>TC-F05</w:t>
             </w:r>
           </w:p>
         </w:tc>
@@ -6212,7 +6400,7 @@
                 <w:sz w:val="19"/>
                 <w:szCs w:val="19"/>
               </w:rPr>
-              <w:t>Done</w:t>
+              <w:t>In progress</w:t>
             </w:r>
           </w:p>
         </w:tc>
@@ -6276,7 +6464,7 @@
                 <w:sz w:val="19"/>
                 <w:szCs w:val="19"/>
               </w:rPr>
-              <w:t>Actuator current check</w:t>
+              <w:t>Actuator current</w:t>
             </w:r>
           </w:p>
         </w:tc>
@@ -6307,7 +6495,7 @@
                 <w:sz w:val="19"/>
                 <w:szCs w:val="19"/>
               </w:rPr>
-              <w:t>FO (auto)</w:t>
+              <w:t>auto</w:t>
             </w:r>
           </w:p>
         </w:tc>
@@ -6338,7 +6526,7 @@
                 <w:sz w:val="19"/>
                 <w:szCs w:val="19"/>
               </w:rPr>
-              <w:t>Relay ON, current &lt; 50 % of normal for 30 s → ACTUATOR_FAULT</w:t>
+              <w:t>Relay ON, current &lt; 50 % of normal 30 s → ACTUATOR_FAULT</w:t>
             </w:r>
           </w:p>
         </w:tc>
@@ -6369,7 +6557,7 @@
                 <w:sz w:val="19"/>
                 <w:szCs w:val="19"/>
               </w:rPr>
-              <w:t>TC-F06-01..03</w:t>
+              <w:t>TC-F06</w:t>
             </w:r>
           </w:p>
         </w:tc>
@@ -6526,7 +6714,7 @@
                 <w:sz w:val="19"/>
                 <w:szCs w:val="19"/>
               </w:rPr>
-              <w:t>Repeats merge into one alert; recovery resolves; ack of resolved → 409</w:t>
+              <w:t>Repeats merge; humidity out 10 min → breach; ack of resolved 409</w:t>
             </w:r>
           </w:p>
         </w:tc>
@@ -6557,7 +6745,7 @@
                 <w:sz w:val="19"/>
                 <w:szCs w:val="19"/>
               </w:rPr>
-              <w:t>TC-F07-01..03</w:t>
+              <w:t>TC-F07</w:t>
             </w:r>
           </w:p>
         </w:tc>
@@ -6683,7 +6871,7 @@
                 <w:sz w:val="19"/>
                 <w:szCs w:val="19"/>
               </w:rPr>
-              <w:t>FO, Telegram, FCM</w:t>
+              <w:t>FO</w:t>
             </w:r>
           </w:p>
         </w:tc>
@@ -6714,7 +6902,7 @@
                 <w:sz w:val="19"/>
                 <w:szCs w:val="19"/>
               </w:rPr>
-              <w:t>CRITICAL alert on both ≤ 5 s; none after sign-out/unlink</w:t>
+              <w:t>CRITICAL on both ≤ 5 s; none after sign-out or unlink</w:t>
             </w:r>
           </w:p>
         </w:tc>
@@ -6745,7 +6933,7 @@
                 <w:sz w:val="19"/>
                 <w:szCs w:val="19"/>
               </w:rPr>
-              <w:t>TC-F08-01..03</w:t>
+              <w:t>TC-F08</w:t>
             </w:r>
           </w:p>
         </w:tc>
@@ -6871,7 +7059,7 @@
                 <w:sz w:val="19"/>
                 <w:szCs w:val="19"/>
               </w:rPr>
-              <w:t>FO, DE (auto)</w:t>
+              <w:t>auto</w:t>
             </w:r>
           </w:p>
         </w:tc>
@@ -6902,7 +7090,7 @@
                 <w:sz w:val="19"/>
                 <w:szCs w:val="19"/>
               </w:rPr>
-              <w:t>≥ 2 h data: crossing within 60 min → FORECAST_BREACH with time; less → "insufficient data"</w:t>
+              <w:t>Crossing within 60 min → FORECAST_BREACH; &lt; 2 h data → none</w:t>
             </w:r>
           </w:p>
         </w:tc>
@@ -6933,7 +7121,7 @@
                 <w:sz w:val="19"/>
                 <w:szCs w:val="19"/>
               </w:rPr>
-              <w:t>TC-F09-01..03</w:t>
+              <w:t>TC-F09</w:t>
             </w:r>
           </w:p>
         </w:tc>
@@ -7059,7 +7247,7 @@
                 <w:sz w:val="19"/>
                 <w:szCs w:val="19"/>
               </w:rPr>
-              <w:t>FO, DE (auto)</w:t>
+              <w:t>auto</w:t>
             </w:r>
           </w:p>
         </w:tc>
@@ -7090,7 +7278,7 @@
                 <w:sz w:val="19"/>
                 <w:szCs w:val="19"/>
               </w:rPr>
-              <w:t>Session and 5-min counts per house; drop &gt; threshold vs ≥ 3 days → one alert; incomplete day skipped</w:t>
+              <w:t>Counts per house; drop &gt; limit vs ≥ 3 days → one alert</w:t>
             </w:r>
           </w:p>
         </w:tc>
@@ -7121,7 +7309,7 @@
                 <w:sz w:val="19"/>
                 <w:szCs w:val="19"/>
               </w:rPr>
-              <w:t>TC-F10-01..03</w:t>
+              <w:t>TC-F10</w:t>
             </w:r>
           </w:p>
         </w:tc>
@@ -7216,7 +7404,7 @@
                 <w:sz w:val="19"/>
                 <w:szCs w:val="19"/>
               </w:rPr>
-              <w:t>Annotated live stream</w:t>
+              <w:t>Live stream</w:t>
             </w:r>
           </w:p>
         </w:tc>
@@ -7278,7 +7466,7 @@
                 <w:sz w:val="19"/>
                 <w:szCs w:val="19"/>
               </w:rPr>
-              <w:t>Box on each bird; token 60 s, one camera; others 403</w:t>
+              <w:t>Box on each bird; 60-s token for one camera; others 403</w:t>
             </w:r>
           </w:p>
         </w:tc>
@@ -7309,7 +7497,7 @@
                 <w:sz w:val="19"/>
                 <w:szCs w:val="19"/>
               </w:rPr>
-              <w:t>TC-F11-01..03</w:t>
+              <w:t>TC-F11</w:t>
             </w:r>
           </w:p>
         </w:tc>
@@ -7435,7 +7623,7 @@
                 <w:sz w:val="19"/>
                 <w:szCs w:val="19"/>
               </w:rPr>
-              <w:t>DE (auto)</w:t>
+              <w:t>auto</w:t>
             </w:r>
           </w:p>
         </w:tc>
@@ -7466,7 +7654,7 @@
                 <w:sz w:val="19"/>
                 <w:szCs w:val="19"/>
               </w:rPr>
-              <w:t>+20 dB for 12 s of 15 s → one NOISE_ANOMALY; none while the speaker plays</w:t>
+              <w:t>+20 dB 12 s of 15 → NOISE_ANOMALY; none while speaker plays</w:t>
             </w:r>
           </w:p>
         </w:tc>
@@ -7497,7 +7685,7 @@
                 <w:sz w:val="19"/>
                 <w:szCs w:val="19"/>
               </w:rPr>
-              <w:t>TC-F12-01..03</w:t>
+              <w:t>TC-F12</w:t>
             </w:r>
           </w:p>
         </w:tc>
@@ -7654,7 +7842,7 @@
                 <w:sz w:val="19"/>
                 <w:szCs w:val="19"/>
               </w:rPr>
-              <w:t>Stored with author; REJECTED without note 422, sets DISMISSED; FO on expert farm 403</w:t>
+              <w:t>REJECTED without note 422, with note DISMISSED; FO 403</w:t>
             </w:r>
           </w:p>
         </w:tc>
@@ -7685,7 +7873,7 @@
                 <w:sz w:val="19"/>
                 <w:szCs w:val="19"/>
               </w:rPr>
-              <w:t>TC-F13-01..03</w:t>
+              <w:t>TC-F13</w:t>
             </w:r>
           </w:p>
         </w:tc>
@@ -7842,7 +8030,7 @@
                 <w:sz w:val="19"/>
                 <w:szCs w:val="19"/>
               </w:rPr>
-              <w:t>Applied without restart, with history; out of range 400; ring of 2 or 13 vertices 422; overlapping windows 400</w:t>
+              <w:t>Applied with history; out of range 400; ring of 13 vertices 422</w:t>
             </w:r>
           </w:p>
         </w:tc>
@@ -7873,7 +8061,7 @@
                 <w:sz w:val="19"/>
                 <w:szCs w:val="19"/>
               </w:rPr>
-              <w:t>TC-F14-01..03</w:t>
+              <w:t>TC-F14</w:t>
             </w:r>
           </w:p>
         </w:tc>
@@ -7968,7 +8156,7 @@
                 <w:sz w:val="19"/>
                 <w:szCs w:val="19"/>
               </w:rPr>
-              <w:t>Review and suggestions</w:t>
+              <w:t>Review, suggestions</w:t>
             </w:r>
           </w:p>
         </w:tc>
@@ -8030,7 +8218,7 @@
                 <w:sz w:val="19"/>
                 <w:szCs w:val="19"/>
               </w:rPr>
-              <w:t>Owner change opens one review item; revert resends old values; owner applying a suggestion 403</w:t>
+              <w:t>Owner change opens a review item; owner applying suggestion 403</w:t>
             </w:r>
           </w:p>
         </w:tc>
@@ -8061,7 +8249,7 @@
                 <w:sz w:val="19"/>
                 <w:szCs w:val="19"/>
               </w:rPr>
-              <w:t>TC-F15-01..03</w:t>
+              <w:t>TC-F15</w:t>
             </w:r>
           </w:p>
         </w:tc>
@@ -8156,7 +8344,7 @@
                 <w:sz w:val="19"/>
                 <w:szCs w:val="19"/>
               </w:rPr>
-              <w:t>Conclusions, owner notice</w:t>
+              <w:t>Conclusions, notices</w:t>
             </w:r>
           </w:p>
         </w:tc>
@@ -8218,7 +8406,7 @@
                 <w:sz w:val="19"/>
                 <w:szCs w:val="19"/>
               </w:rPr>
-              <w:t>Every expert decision notifies each owner; only the author edits a conclusion</w:t>
+              <w:t>Every expert decision notifies each owner; only the author edits</w:t>
             </w:r>
           </w:p>
         </w:tc>
@@ -8249,7 +8437,7 @@
                 <w:sz w:val="19"/>
                 <w:szCs w:val="19"/>
               </w:rPr>
-              <w:t>TC-F16-01..03</w:t>
+              <w:t>TC-F16</w:t>
             </w:r>
           </w:p>
         </w:tc>
@@ -8406,7 +8594,7 @@
                 <w:sz w:val="19"/>
                 <w:szCs w:val="19"/>
               </w:rPr>
-              <w:t>MANUAL then AUTO at expiry; outside 1 min–24 h 422; expert 403</w:t>
+              <w:t>Own expiry per relay; pump 31 min 422; unconfirmed with alert 409</w:t>
             </w:r>
           </w:p>
         </w:tc>
@@ -8437,7 +8625,7 @@
                 <w:sz w:val="19"/>
                 <w:szCs w:val="19"/>
               </w:rPr>
-              <w:t>TC-F17-01..03</w:t>
+              <w:t>TC-F17</w:t>
             </w:r>
           </w:p>
         </w:tc>
@@ -8468,7 +8656,7 @@
                 <w:sz w:val="19"/>
                 <w:szCs w:val="19"/>
               </w:rPr>
-              <w:t>Done</w:t>
+              <w:t>In progress</w:t>
             </w:r>
           </w:p>
         </w:tc>
@@ -8532,7 +8720,7 @@
                 <w:sz w:val="19"/>
                 <w:szCs w:val="19"/>
               </w:rPr>
-              <w:t>Register by QR</w:t>
+              <w:t>Farm structure and device registration</w:t>
             </w:r>
           </w:p>
         </w:tc>
@@ -8594,7 +8782,7 @@
                 <w:sz w:val="19"/>
                 <w:szCs w:val="19"/>
               </w:rPr>
-              <w:t>Label + floor scan → PENDING in that zone; bad key or ID same 400; in service 409</w:t>
+              <w:t>Farm, house, zone; scans → PENDING; bad key 400; in service 409</w:t>
             </w:r>
           </w:p>
         </w:tc>
@@ -8625,7 +8813,7 @@
                 <w:sz w:val="19"/>
                 <w:szCs w:val="19"/>
               </w:rPr>
-              <w:t>TC-F18-01..03</w:t>
+              <w:t>TC-F18</w:t>
             </w:r>
           </w:p>
         </w:tc>
@@ -8720,7 +8908,7 @@
                 <w:sz w:val="19"/>
                 <w:szCs w:val="19"/>
               </w:rPr>
-              <w:t>Setup progress, move</w:t>
+              <w:t>Device lifecycle, diagnostics and setup progress</w:t>
             </w:r>
           </w:p>
         </w:tc>
@@ -8782,7 +8970,7 @@
                 <w:sz w:val="19"/>
                 <w:szCs w:val="19"/>
               </w:rPr>
-              <w:t>"Applied" only after the version is reported; offline move corrected on reconnect; 15-min notice</w:t>
+              <w:t>Progress shown; "applied" after version; offline move on reconnect</w:t>
             </w:r>
           </w:p>
         </w:tc>
@@ -8813,7 +9001,7 @@
                 <w:sz w:val="19"/>
                 <w:szCs w:val="19"/>
               </w:rPr>
-              <w:t>TC-F19-01..03</w:t>
+              <w:t>TC-F19</w:t>
             </w:r>
           </w:p>
         </w:tc>
@@ -8939,7 +9127,7 @@
                 <w:sz w:val="19"/>
                 <w:szCs w:val="19"/>
               </w:rPr>
-              <w:t>FO, DE (auto)</w:t>
+              <w:t>auto</w:t>
             </w:r>
           </w:p>
         </w:tc>
@@ -8970,7 +9158,7 @@
                 <w:sz w:val="19"/>
                 <w:szCs w:val="19"/>
               </w:rPr>
-              <w:t>Flock CLEAR + humidity SLIGHT → ACTION; flock alone → WATCH; incomplete → INSUFFICIENT_DATA</w:t>
+              <w:t>Flock CLEAR + humidity SLIGHT → ACTION; flock alone → WATCH</w:t>
             </w:r>
           </w:p>
         </w:tc>
@@ -9001,7 +9189,7 @@
                 <w:sz w:val="19"/>
                 <w:szCs w:val="19"/>
               </w:rPr>
-              <w:t>TC-F20-01..03</w:t>
+              <w:t>TC-F20</w:t>
             </w:r>
           </w:p>
         </w:tc>
@@ -9158,7 +9346,7 @@
                 <w:sz w:val="19"/>
                 <w:szCs w:val="19"/>
               </w:rPr>
-              <w:t>Day/week/month per house; files match the screen, no internal IDs; other farms 403</w:t>
+              <w:t>Day/week/month per house; files match the screen; others 403</w:t>
             </w:r>
           </w:p>
         </w:tc>
@@ -9189,7 +9377,7 @@
                 <w:sz w:val="19"/>
                 <w:szCs w:val="19"/>
               </w:rPr>
-              <w:t>TC-F21-01..03</w:t>
+              <w:t>TC-F21</w:t>
             </w:r>
           </w:p>
         </w:tc>
@@ -9346,7 +9534,7 @@
                 <w:sz w:val="19"/>
                 <w:szCs w:val="19"/>
               </w:rPr>
-              <w:t>Asked before the status, locked after; Technician/Admin 403; ≤ 7 days after</w:t>
+              <w:t>Asked before status; snapshot kept; Technician/Admin 403</w:t>
             </w:r>
           </w:p>
         </w:tc>
@@ -9377,7 +9565,7 @@
                 <w:sz w:val="19"/>
                 <w:szCs w:val="19"/>
               </w:rPr>
-              <w:t>TC-F22-01..03</w:t>
+              <w:t>TC-F22</w:t>
             </w:r>
           </w:p>
         </w:tc>
@@ -9419,7 +9607,7 @@
         <w:spacing w:after="60"/>
       </w:pPr>
       <w:r>
-        <w:t>FO = Farm Owner; DE = Domain Expert (Farm Owner if none, BR-22); (auto) = done by a system component, not an actor.</w:t>
+        <w:t>FO = Farm Owner; DE = Domain Expert (Farm Owner if none, BR-22); auto = done by a system component, not an actor; TC-Fnn = TC-Fnn-01..03 in Report 5. Status is copied from Project Tracking.</w:t>
       </w:r>
     </w:p>
     <w:p>
@@ -9718,7 +9906,7 @@
                 <w:sz w:val="19"/>
                 <w:szCs w:val="19"/>
               </w:rPr>
-              <w:t>Publish → dashboard event</w:t>
+              <w:t>Publish → dashboard</w:t>
             </w:r>
           </w:p>
         </w:tc>
@@ -9780,7 +9968,7 @@
                 <w:sz w:val="19"/>
                 <w:szCs w:val="19"/>
               </w:rPr>
-              <w:t>200 MQTT messages on staging, Socket.io receive times</w:t>
+              <w:t>200 MQTT messages on staging</w:t>
             </w:r>
           </w:p>
         </w:tc>
@@ -9875,7 +10063,7 @@
                 <w:sz w:val="19"/>
                 <w:szCs w:val="19"/>
               </w:rPr>
-              <w:t>Alert → in-app, push, Telegram</w:t>
+              <w:t>Alert → app, push, Telegram</w:t>
             </w:r>
           </w:p>
         </w:tc>
@@ -10032,7 +10220,7 @@
                 <w:sz w:val="19"/>
                 <w:szCs w:val="19"/>
               </w:rPr>
-              <w:t>Decisions in outage; samples lost</w:t>
+              <w:t>Decisions; samples and alerts lost</w:t>
             </w:r>
           </w:p>
         </w:tc>
@@ -10063,7 +10251,7 @@
                 <w:sz w:val="19"/>
                 <w:szCs w:val="19"/>
               </w:rPr>
-              <w:t>100 %; 0 for 30 min</w:t>
+              <w:t>100 %; 0 in a 30-min outage</w:t>
             </w:r>
           </w:p>
         </w:tc>
@@ -10094,7 +10282,7 @@
                 <w:sz w:val="19"/>
                 <w:szCs w:val="19"/>
               </w:rPr>
-              <w:t>Uplink cut 30 min on the prototype</w:t>
+              <w:t>Uplink cut on the prototype</w:t>
             </w:r>
           </w:p>
         </w:tc>
@@ -10189,7 +10377,7 @@
                 <w:sz w:val="19"/>
                 <w:szCs w:val="19"/>
               </w:rPr>
-              <w:t>Precision, Recall, count error</w:t>
+              <w:t>Detection P, R; count error</w:t>
             </w:r>
           </w:p>
         </w:tc>
@@ -10220,7 +10408,7 @@
                 <w:sz w:val="19"/>
                 <w:szCs w:val="19"/>
               </w:rPr>
-              <w:t>[TEAM: P ≥ X, R ≥ Y, ≤ Z %] by lighting</w:t>
+              <w:t>≥ 0.80; ≤ 10 %</w:t>
             </w:r>
           </w:p>
         </w:tc>
@@ -10251,7 +10439,7 @@
                 <w:sz w:val="19"/>
                 <w:szCs w:val="19"/>
               </w:rPr>
-              <w:t>Manual counts on [TEAM: N] clips</w:t>
+              <w:t>Unseen days, per lighting</w:t>
             </w:r>
           </w:p>
         </w:tc>
@@ -10346,7 +10534,7 @@
                 <w:sz w:val="19"/>
                 <w:szCs w:val="19"/>
               </w:rPr>
-              <w:t>Power-on → "applied"; input</w:t>
+              <w:t>Power-on → "applied"</w:t>
             </w:r>
           </w:p>
         </w:tc>
@@ -10408,7 +10596,7 @@
                 <w:sz w:val="19"/>
                 <w:szCs w:val="19"/>
               </w:rPr>
-              <w:t>5 first-time users, timed</w:t>
+              <w:t>5 first-time users</w:t>
             </w:r>
           </w:p>
         </w:tc>
@@ -10503,7 +10691,7 @@
                 <w:sz w:val="19"/>
                 <w:szCs w:val="19"/>
               </w:rPr>
-              <w:t>Agreement, kappa vs ratings</w:t>
+              <w:t>Rating vs snapshot agreement</w:t>
             </w:r>
           </w:p>
         </w:tc>
@@ -10534,7 +10722,7 @@
                 <w:sz w:val="19"/>
                 <w:szCs w:val="19"/>
               </w:rPr>
-              <w:t>[TEAM: ≥ X %, κ ≥ Y], ≥ 14 days</w:t>
+              <w:t>≥ 70 % (95 % CI), ≥ 14 days</w:t>
             </w:r>
           </w:p>
         </w:tc>
@@ -10867,7 +11055,7 @@
                 <w:sz w:val="19"/>
                 <w:szCs w:val="19"/>
               </w:rPr>
-              <w:t>Firmware; AI pipeline; backend MQTT ingestion and alert engine</w:t>
+              <w:t>Firmware; AI pipeline; MQTT ingestion and alerts</w:t>
             </w:r>
           </w:p>
         </w:tc>
@@ -10929,7 +11117,7 @@
                 <w:sz w:val="19"/>
                 <w:szCs w:val="19"/>
               </w:rPr>
-              <w:t>D1, D2; PR #88</w:t>
+              <w:t>D1, D2; #88</w:t>
             </w:r>
           </w:p>
         </w:tc>
@@ -11024,7 +11212,7 @@
                 <w:sz w:val="19"/>
                 <w:szCs w:val="19"/>
               </w:rPr>
-              <w:t>Backend devices and setup; ticket removal; mobile app</w:t>
+              <w:t>Devices and setup; scope cleanup; mobile app</w:t>
             </w:r>
           </w:p>
         </w:tc>
@@ -11181,7 +11369,7 @@
                 <w:sz w:val="19"/>
                 <w:szCs w:val="19"/>
               </w:rPr>
-              <w:t>Farm Owner screens; notification settings and inbox</w:t>
+              <w:t>Farm Owner screens; notifications</w:t>
             </w:r>
           </w:p>
         </w:tc>
@@ -11338,7 +11526,7 @@
                 <w:sz w:val="19"/>
                 <w:szCs w:val="19"/>
               </w:rPr>
-              <w:t>Admin screens (accounts, stock, defaults); daily status, reports, export</w:t>
+              <w:t>Admin screens; daily status, reports, export</w:t>
             </w:r>
           </w:p>
         </w:tc>
@@ -11495,7 +11683,7 @@
                 <w:sz w:val="19"/>
                 <w:szCs w:val="19"/>
               </w:rPr>
-              <w:t>Expert screens; expert backend (reviews, proposals)</w:t>
+              <w:t>Expert screens and backend (reviews, proposals)</w:t>
             </w:r>
           </w:p>
         </w:tc>
@@ -11557,7 +11745,7 @@
                 <w:sz w:val="19"/>
                 <w:szCs w:val="19"/>
               </w:rPr>
-              <w:t>D3; PR #91</w:t>
+              <w:t>D3; #91</w:t>
             </w:r>
           </w:p>
         </w:tc>
@@ -12763,7 +12951,7 @@
                 <w:sz w:val="19"/>
                 <w:szCs w:val="19"/>
               </w:rPr>
-              <w:t>Pump dry, sensor fault, load not drawing current</w:t>
+              <w:t>Misting without humidity rise, sensor fault, load not drawing current</w:t>
             </w:r>
           </w:p>
         </w:tc>
@@ -14606,7 +14794,7 @@
                 <w:sz w:val="19"/>
                 <w:szCs w:val="19"/>
               </w:rPr>
-              <w:t>Daily status: (new) → COMPUTED → RATED; report: GENERATED</w:t>
+              <w:t>Daily status: (new) → COMPUTED; each assessor's rating: PENDING → RATED; report: GENERATED</w:t>
             </w:r>
           </w:p>
         </w:tc>
@@ -16202,7 +16390,7 @@
                 <w:sz w:val="19"/>
                 <w:szCs w:val="19"/>
               </w:rPr>
-              <w:t>Heartbeat back within 30 s; POWER_OUTAGE reported</w:t>
+              <w:t>Heartbeat back within 30 s; UNEXPECTED_RESTART with reset reason POWER_ON</w:t>
             </w:r>
           </w:p>
         </w:tc>
@@ -16421,7 +16609,7 @@
                 <w:sz w:val="19"/>
                 <w:szCs w:val="19"/>
               </w:rPr>
-              <w:t>After 300 s without rise misting stops and one PUMP_DRY is raised; owner acknowledges</w:t>
+              <w:t>After 300 s without rise automatic misting stops and one MISTING_INEFFECTIVE is raised; owner acknowledges</w:t>
             </w:r>
           </w:p>
         </w:tc>
@@ -18768,7 +18956,7 @@
                 <w:sz w:val="19"/>
                 <w:szCs w:val="19"/>
               </w:rPr>
-              <w:t>Same zone</w:t>
+              <w:t>Same zone; a SENSOR_FAULT open</w:t>
             </w:r>
           </w:p>
         </w:tc>
@@ -18799,7 +18987,7 @@
                 <w:sz w:val="19"/>
                 <w:szCs w:val="19"/>
               </w:rPr>
-              <w:t>Override for 25 h; Domain Expert tries an override</w:t>
+              <w:t>Pump ON for 31 min; pump ON without confirming the alert; Domain Expert tries an override</w:t>
             </w:r>
           </w:p>
         </w:tc>
@@ -18830,7 +19018,7 @@
                 <w:sz w:val="19"/>
                 <w:szCs w:val="19"/>
               </w:rPr>
-              <w:t>422; 403</w:t>
+              <w:t>422; 409; 403</w:t>
             </w:r>
           </w:p>
         </w:tc>
@@ -20225,7 +20413,7 @@
                 <w:sz w:val="19"/>
                 <w:szCs w:val="19"/>
               </w:rPr>
-              <w:t>48</w:t>
+              <w:t>53</w:t>
             </w:r>
           </w:p>
         </w:tc>
@@ -20287,7 +20475,7 @@
                 <w:sz w:val="19"/>
                 <w:szCs w:val="19"/>
               </w:rPr>
-              <w:t>48</w:t>
+              <w:t>53</w:t>
             </w:r>
           </w:p>
         </w:tc>
@@ -20537,7 +20725,7 @@
                 <w:sz w:val="19"/>
                 <w:szCs w:val="19"/>
               </w:rPr>
-              <w:t>131</w:t>
+              <w:t>136</w:t>
             </w:r>
           </w:p>
         </w:tc>
@@ -20553,7 +20741,7 @@
           <w:sz w:val="19"/>
           <w:szCs w:val="19"/>
         </w:rPr>
-        <w:t>Automated in CI: at least 50% of the committed total (≥ 66 test cases). Transitions counted from SRS Section 6: alert status 10, verdict 2, relay mode 3, device 4, device label 6, configuration sync 4, review item 6, proposal 5, daily health status 5, health report 3.</w:t>
+        <w:t>Automated in CI: at least 50% of the committed total, i.e. at least 68 test cases. State transitions counted (SRS Section 6): alert status 10, alert verdict 2, relay mode 4, device connection 5, device label 6, configuration sync 5, review item 6, suggestion proposal 5, daily health status 2, assessor rating 5, health report 3. Test cases are listed in Report 5.</w:t>
       </w:r>
     </w:p>
     <w:sectPr>

</xml_diff>

<commit_message>
docs(srs): split the review-2 work by member and settle the expert web screens
Backend code by Bao and Kiet only; web and mobile per role for Len, Tuan and Nhi, with E2E tests, client-side NFR measurements and dataset labelling. Staging and documents shared, led by Bao. The Domain Expert reads the Farm Owner pages read-only and keeps /expert/* for its decisions; /stream/:id removed.
</commit_message>
<xml_diff>
--- a/docs/reports/design-brief/SWP490_R2_BM01_Design_Brief_SwiftletCare.docx
+++ b/docs/reports/design-brief/SWP490_R2_BM01_Design_Brief_SwiftletCare.docx
@@ -3466,7 +3466,7 @@
                 <w:sz w:val="19"/>
                 <w:szCs w:val="19"/>
               </w:rPr>
-              <w:t>Trần Minh Kiệt</w:t>
+              <w:t>Nguyễn Chí Bảo</w:t>
             </w:r>
           </w:p>
         </w:tc>
@@ -3864,7 +3864,7 @@
                 <w:sz w:val="19"/>
                 <w:szCs w:val="19"/>
               </w:rPr>
-              <w:t>Trần Minh Kiệt</w:t>
+              <w:t>Kiệt</w:t>
             </w:r>
           </w:p>
         </w:tc>
@@ -4052,7 +4052,7 @@
                 <w:sz w:val="19"/>
                 <w:szCs w:val="19"/>
               </w:rPr>
-              <w:t>Trần Minh Kiệt</w:t>
+              <w:t>Kiệt, Nhi, Bảo</w:t>
             </w:r>
           </w:p>
         </w:tc>
@@ -4240,7 +4240,7 @@
                 <w:sz w:val="19"/>
                 <w:szCs w:val="19"/>
               </w:rPr>
-              <w:t>Thái Minh Tuấn</w:t>
+              <w:t>Tuấn, Kiệt</w:t>
             </w:r>
           </w:p>
         </w:tc>
@@ -4428,7 +4428,7 @@
                 <w:sz w:val="19"/>
                 <w:szCs w:val="19"/>
               </w:rPr>
-              <w:t>Nguyễn Vũ Len</w:t>
+              <w:t>Kiệt, Len</w:t>
             </w:r>
           </w:p>
         </w:tc>
@@ -4616,7 +4616,7 @@
                 <w:sz w:val="19"/>
                 <w:szCs w:val="19"/>
               </w:rPr>
-              <w:t>Nguyễn Chí Bảo</w:t>
+              <w:t>Bảo</w:t>
             </w:r>
           </w:p>
         </w:tc>
@@ -4804,7 +4804,7 @@
                 <w:sz w:val="19"/>
                 <w:szCs w:val="19"/>
               </w:rPr>
-              <w:t>Nguyễn Thị Yến Nhi</w:t>
+              <w:t>Nhi, Kiệt</w:t>
             </w:r>
           </w:p>
         </w:tc>
@@ -4992,7 +4992,7 @@
                 <w:sz w:val="19"/>
                 <w:szCs w:val="19"/>
               </w:rPr>
-              <w:t>Nguyễn Chí Bảo</w:t>
+              <w:t>Bảo</w:t>
             </w:r>
           </w:p>
         </w:tc>
@@ -5180,7 +5180,7 @@
                 <w:sz w:val="19"/>
                 <w:szCs w:val="19"/>
               </w:rPr>
-              <w:t>Trần Minh Kiệt</w:t>
+              <w:t>Bảo</w:t>
             </w:r>
           </w:p>
         </w:tc>
@@ -11055,7 +11055,7 @@
                 <w:sz w:val="19"/>
                 <w:szCs w:val="19"/>
               </w:rPr>
-              <w:t>Firmware; AI pipeline; MQTT ingestion and alerts</w:t>
+              <w:t>Firmware, MQTT; AI pipeline; staging, push, documents</w:t>
             </w:r>
           </w:p>
         </w:tc>
@@ -11181,7 +11181,7 @@
                 <w:sz w:val="19"/>
                 <w:szCs w:val="19"/>
               </w:rPr>
-              <w:t>Backend, mobile</w:t>
+              <w:t>Backend, firmware</w:t>
             </w:r>
           </w:p>
         </w:tc>
@@ -11212,7 +11212,7 @@
                 <w:sz w:val="19"/>
                 <w:szCs w:val="19"/>
               </w:rPr>
-              <w:t>Devices and setup; scope cleanup; mobile app</w:t>
+              <w:t>Devices, accounts; alerts, expert; daily health</w:t>
             </w:r>
           </w:p>
         </w:tc>
@@ -11338,7 +11338,7 @@
                 <w:sz w:val="19"/>
                 <w:szCs w:val="19"/>
               </w:rPr>
-              <w:t>Web Farm Owner</w:t>
+              <w:t>Web, mobile: Owner</w:t>
             </w:r>
           </w:p>
         </w:tc>
@@ -11369,7 +11369,7 @@
                 <w:sz w:val="19"/>
                 <w:szCs w:val="19"/>
               </w:rPr>
-              <w:t>Farm Owner screens; notifications</w:t>
+              <w:t>Farm Owner screens; E2E</w:t>
             </w:r>
           </w:p>
         </w:tc>
@@ -11400,7 +11400,7 @@
                 <w:sz w:val="19"/>
                 <w:szCs w:val="19"/>
               </w:rPr>
-              <w:t>WF-02, 09</w:t>
+              <w:t>WF-02, 05, 09</w:t>
             </w:r>
           </w:p>
         </w:tc>
@@ -11495,7 +11495,7 @@
                 <w:sz w:val="19"/>
                 <w:szCs w:val="19"/>
               </w:rPr>
-              <w:t>Web Admin, reports</w:t>
+              <w:t>Web, mobile: Admin</w:t>
             </w:r>
           </w:p>
         </w:tc>
@@ -11526,7 +11526,7 @@
                 <w:sz w:val="19"/>
                 <w:szCs w:val="19"/>
               </w:rPr>
-              <w:t>Admin screens; daily status, reports, export</w:t>
+              <w:t>Admin, daily status screens; mobile base; E2E</w:t>
             </w:r>
           </w:p>
         </w:tc>
@@ -11557,7 +11557,7 @@
                 <w:sz w:val="19"/>
                 <w:szCs w:val="19"/>
               </w:rPr>
-              <w:t>WF-05, 11</w:t>
+              <w:t>WF-11</w:t>
             </w:r>
           </w:p>
         </w:tc>
@@ -11652,7 +11652,7 @@
                 <w:sz w:val="19"/>
                 <w:szCs w:val="19"/>
               </w:rPr>
-              <w:t>Web Domain Expert</w:t>
+              <w:t>Web, mobile: Expert</w:t>
             </w:r>
           </w:p>
         </w:tc>
@@ -11683,7 +11683,7 @@
                 <w:sz w:val="19"/>
                 <w:szCs w:val="19"/>
               </w:rPr>
-              <w:t>Expert screens and backend (reviews, proposals)</w:t>
+              <w:t>Expert, Technician screens; E2E</w:t>
             </w:r>
           </w:p>
         </w:tc>
@@ -13294,7 +13294,7 @@
                 <w:sz w:val="19"/>
                 <w:szCs w:val="19"/>
               </w:rPr>
-              <w:t>Alert: ACTIVE → RESOLVED; verdict: pending → CONFIRMED</w:t>
+              <w:t>Nguyễn Vũ Len</w:t>
             </w:r>
           </w:p>
         </w:tc>
@@ -17078,7 +17078,7 @@
                 <w:sz w:val="19"/>
                 <w:szCs w:val="19"/>
               </w:rPr>
-              <w:t>Nguyễn Thị Yến Nhi</w:t>
+              <w:t>Nguyễn Vũ Len</w:t>
             </w:r>
           </w:p>
         </w:tc>
@@ -17297,7 +17297,7 @@
                 <w:sz w:val="19"/>
                 <w:szCs w:val="19"/>
               </w:rPr>
-              <w:t>Nguyễn Thị Yến Nhi</w:t>
+              <w:t>Nguyễn Vũ Len</w:t>
             </w:r>
           </w:p>
         </w:tc>

</xml_diff>

<commit_message>
docs(srs): record G-01 as done in the guidance files and the Review 2 forms
CLAUDE.md, BM01 section 5, Project Tracking (milestone, F-04, F-05, G-14), the review-2 todo,
firmware and FE_Design notes still listed the enumeration work as open after PR #113.
</commit_message>
<xml_diff>
--- a/docs/reports/design-brief/SWP490_R2_BM01_Design_Brief_SwiftletCare.docx
+++ b/docs/reports/design-brief/SWP490_R2_BM01_Design_Brief_SwiftletCare.docx
@@ -3740,7 +3740,7 @@
                 <w:sz w:val="19"/>
                 <w:szCs w:val="19"/>
               </w:rPr>
-              <w:t>G-01, 14</w:t>
+              <w:t>G-14</w:t>
             </w:r>
           </w:p>
         </w:tc>
@@ -3771,7 +3771,7 @@
                 <w:sz w:val="19"/>
                 <w:szCs w:val="19"/>
               </w:rPr>
-              <w:t>Alert-type renames, DISMISSED, new types; predator, Zalo/SMS, heating left; data model behind SDD 6.1</w:t>
+              <w:t>Data model behind SDD 6.1 (user status, audit source, harvest type and photo, alert details)</w:t>
             </w:r>
           </w:p>
         </w:tc>
@@ -3802,7 +3802,7 @@
                 <w:sz w:val="19"/>
                 <w:szCs w:val="19"/>
               </w:rPr>
-              <w:t>all modules</w:t>
+              <w:t>backend</w:t>
             </w:r>
           </w:p>
         </w:tc>
@@ -3833,7 +3833,7 @@
                 <w:sz w:val="19"/>
                 <w:szCs w:val="19"/>
               </w:rPr>
-              <w:t>One enum PR with migration, then SDD 6.4</w:t>
+              <w:t>SDD 6.1–6.4</w:t>
             </w:r>
           </w:p>
         </w:tc>
@@ -3895,7 +3895,7 @@
                 <w:sz w:val="19"/>
                 <w:szCs w:val="19"/>
               </w:rPr>
-              <w:t>Tag; It. 2</w:t>
+              <w:t>It. 2</w:t>
             </w:r>
           </w:p>
         </w:tc>

</xml_diff>